<commit_message>
Feat: Added Fundamentals Part 1
</commit_message>
<xml_diff>
--- a/get-set-go.docx
+++ b/get-set-go.docx
@@ -30,7 +30,11 @@
             <w:pPr>
               <w:pStyle w:val="Normal"/>
               <w:spacing w:before="0" w:after="0"/>
-              <w:rPr/>
+              <w:jc w:val="start"/>
+              <w:rPr>
+                <w:sz w:val="120"/>
+                <w:szCs w:val="120"/>
+              </w:rPr>
             </w:pPr>
             <w:r>
               <w:rPr>
@@ -38,8 +42,19 @@
                 <w:b/>
                 <w:bCs/>
                 <w:color w:val="7FFFD4"/>
-                <w:sz w:val="140"/>
-                <w:szCs w:val="140"/>
+                <w:sz w:val="120"/>
+                <w:szCs w:val="120"/>
+              </w:rPr>
+              <w:t>Get-Set-</w:t>
+            </w:r>
+            <w:r>
+              <w:rPr>
+                <w:rFonts w:eastAsia="Arial" w:cs="Arial"/>
+                <w:b/>
+                <w:bCs/>
+                <w:color w:val="7FFFD4"/>
+                <w:sz w:val="120"/>
+                <w:szCs w:val="120"/>
               </w:rPr>
               <w:t>Go</w:t>
             </w:r>
@@ -47,8 +62,37 @@
           <w:p>
             <w:pPr>
               <w:pStyle w:val="Normal"/>
+              <w:spacing w:before="0" w:after="0"/>
+              <w:jc w:val="start"/>
+              <w:rPr>
+                <w:rFonts w:eastAsia="Arial" w:cs="Arial"/>
+                <w:b/>
+                <w:bCs/>
+                <w:color w:val="7FFFD4"/>
+                <w:sz w:val="36"/>
+                <w:szCs w:val="36"/>
+              </w:rPr>
+            </w:pPr>
+            <w:r>
+              <w:rPr>
+                <w:rFonts w:eastAsia="Arial" w:cs="Arial"/>
+                <w:b/>
+                <w:bCs/>
+                <w:color w:val="7FFFD4"/>
+                <w:sz w:val="36"/>
+                <w:szCs w:val="36"/>
+              </w:rPr>
+            </w:r>
+          </w:p>
+          <w:p>
+            <w:pPr>
+              <w:pStyle w:val="Normal"/>
               <w:spacing w:before="0" w:after="200"/>
-              <w:rPr/>
+              <w:jc w:val="start"/>
+              <w:rPr>
+                <w:sz w:val="56"/>
+                <w:szCs w:val="56"/>
+              </w:rPr>
             </w:pPr>
             <w:r>
               <w:rPr>
@@ -56,8 +100,19 @@
                 <w:b/>
                 <w:bCs/>
                 <w:color w:val="FFFFFF"/>
-                <w:sz w:val="64"/>
-                <w:szCs w:val="64"/>
+                <w:sz w:val="56"/>
+                <w:szCs w:val="56"/>
+              </w:rPr>
+              <w:t xml:space="preserve">Documenting My GoLang’s </w:t>
+            </w:r>
+            <w:r>
+              <w:rPr>
+                <w:rFonts w:eastAsia="Arial" w:cs="Arial"/>
+                <w:b/>
+                <w:bCs/>
+                <w:color w:val="FFFFFF"/>
+                <w:sz w:val="56"/>
+                <w:szCs w:val="56"/>
               </w:rPr>
               <w:t>Learning Journey</w:t>
             </w:r>
@@ -65,7 +120,33 @@
           <w:p>
             <w:pPr>
               <w:pStyle w:val="Normal"/>
+              <w:spacing w:before="0" w:after="200"/>
+              <w:jc w:val="start"/>
+              <w:rPr>
+                <w:rFonts w:eastAsia="Arial" w:cs="Arial"/>
+                <w:b/>
+                <w:bCs/>
+                <w:color w:val="FFFFFF"/>
+                <w:sz w:val="24"/>
+                <w:szCs w:val="24"/>
+              </w:rPr>
+            </w:pPr>
+            <w:r>
+              <w:rPr>
+                <w:rFonts w:eastAsia="Arial" w:cs="Arial"/>
+                <w:b/>
+                <w:bCs/>
+                <w:color w:val="FFFFFF"/>
+                <w:sz w:val="24"/>
+                <w:szCs w:val="24"/>
+              </w:rPr>
+            </w:r>
+          </w:p>
+          <w:p>
+            <w:pPr>
+              <w:pStyle w:val="Normal"/>
               <w:spacing w:before="0" w:after="80"/>
+              <w:jc w:val="start"/>
               <w:rPr/>
             </w:pPr>
             <w:r>
@@ -75,8 +156,16 @@
                 <w:sz w:val="26"/>
                 <w:szCs w:val="26"/>
               </w:rPr>
-              <w:t xml:space="preserve">Complete Roadmap · 7 Phases · Backend </w:t>
-            </w:r>
+              <w:t>Complete Roadmap · 7 Phases · Backend Development + Linux Development</w:t>
+            </w:r>
+          </w:p>
+          <w:p>
+            <w:pPr>
+              <w:pStyle w:val="Normal"/>
+              <w:spacing w:before="0" w:after="400"/>
+              <w:jc w:val="start"/>
+              <w:rPr/>
+            </w:pPr>
             <w:r>
               <w:rPr>
                 <w:rFonts w:eastAsia="Arial" w:cs="Arial"/>
@@ -84,7 +173,7 @@
                 <w:sz w:val="26"/>
                 <w:szCs w:val="26"/>
               </w:rPr>
-              <w:t>Development</w:t>
+              <w:t xml:space="preserve">From Zero to Production-Grade Go </w:t>
             </w:r>
             <w:r>
               <w:rPr>
@@ -93,56 +182,14 @@
                 <w:sz w:val="26"/>
                 <w:szCs w:val="26"/>
               </w:rPr>
-              <w:t xml:space="preserve"> +</w:t>
-            </w:r>
-            <w:r>
-              <w:rPr>
-                <w:rFonts w:eastAsia="Arial" w:cs="Arial"/>
-                <w:color w:val="A7F3D0"/>
-                <w:sz w:val="26"/>
-                <w:szCs w:val="26"/>
-              </w:rPr>
-              <w:t xml:space="preserve"> </w:t>
-            </w:r>
-            <w:r>
-              <w:rPr>
-                <w:rFonts w:eastAsia="Arial" w:cs="Arial"/>
-                <w:color w:val="A7F3D0"/>
-                <w:sz w:val="26"/>
-                <w:szCs w:val="26"/>
-              </w:rPr>
-              <w:t xml:space="preserve">Linux </w:t>
-            </w:r>
-            <w:r>
-              <w:rPr>
-                <w:rFonts w:eastAsia="Arial" w:cs="Arial"/>
-                <w:color w:val="A7F3D0"/>
-                <w:sz w:val="26"/>
-                <w:szCs w:val="26"/>
-              </w:rPr>
               <w:t>Development</w:t>
             </w:r>
           </w:p>
           <w:p>
             <w:pPr>
               <w:pStyle w:val="Normal"/>
-              <w:spacing w:before="0" w:after="400"/>
-              <w:rPr/>
-            </w:pPr>
-            <w:r>
-              <w:rPr>
-                <w:rFonts w:eastAsia="Arial" w:cs="Arial"/>
-                <w:color w:val="A7F3D0"/>
-                <w:sz w:val="26"/>
-                <w:szCs w:val="26"/>
-              </w:rPr>
-              <w:t>From Zero to Production-Grade Go Developer</w:t>
-            </w:r>
-          </w:p>
-          <w:p>
-            <w:pPr>
-              <w:pStyle w:val="Normal"/>
-              <w:spacing w:before="0" w:after="0"/>
+              <w:spacing w:before="0" w:after="0"/>
+              <w:jc w:val="start"/>
               <w:rPr/>
             </w:pPr>
             <w:r>
@@ -152,7 +199,7 @@
                 <w:sz w:val="22"/>
                 <w:szCs w:val="22"/>
               </w:rPr>
-              <w:t>Developer Akshat</w:t>
+              <w:t>Dev-X-Akshat</w:t>
             </w:r>
             <w:r>
               <w:rPr>
@@ -161,7 +208,7 @@
                 <w:sz w:val="22"/>
                 <w:szCs w:val="22"/>
               </w:rPr>
-              <w:t xml:space="preserve">  ·  2025–2026  ·  Personal Reference</w:t>
+              <w:t xml:space="preserve">  ·  2026  </w:t>
             </w:r>
           </w:p>
         </w:tc>
@@ -191,7 +238,7 @@
       </w:pPr>
       <w:r>
         <w:rPr>
-          <w:rFonts w:eastAsia="Arial" w:cs="Arial" w:ascii="Arial" w:hAnsi="Arial"/>
+          <w:rFonts w:eastAsia="Arial" w:cs="Arial"/>
           <w:b/>
           <w:bCs/>
           <w:color w:val="0F5540"/>
@@ -235,7 +282,7 @@
       </w:pPr>
       <w:r>
         <w:rPr>
-          <w:rFonts w:eastAsia="Arial" w:cs="Arial" w:ascii="Arial" w:hAnsi="Arial"/>
+          <w:rFonts w:eastAsia="Arial" w:cs="Arial"/>
           <w:b/>
           <w:bCs/>
           <w:color w:val="111827"/>
@@ -667,7 +714,7 @@
       </w:pPr>
       <w:r>
         <w:rPr>
-          <w:rFonts w:eastAsia="Arial" w:cs="Arial" w:ascii="Arial" w:hAnsi="Arial"/>
+          <w:rFonts w:eastAsia="Arial" w:cs="Arial"/>
           <w:b/>
           <w:bCs/>
           <w:color w:val="111827"/>
@@ -803,7 +850,7 @@
       </w:pPr>
       <w:r>
         <w:rPr>
-          <w:rFonts w:eastAsia="Arial" w:cs="Arial" w:ascii="Arial" w:hAnsi="Arial"/>
+          <w:rFonts w:eastAsia="Arial" w:cs="Arial"/>
           <w:b/>
           <w:bCs/>
           <w:color w:val="111827"/>
@@ -828,9 +875,9 @@
       </w:tblPr>
       <w:tblGrid>
         <w:gridCol w:w="380"/>
-        <w:gridCol w:w="2399"/>
+        <w:gridCol w:w="2398"/>
         <w:gridCol w:w="1400"/>
-        <w:gridCol w:w="5541"/>
+        <w:gridCol w:w="5542"/>
       </w:tblGrid>
       <w:tr>
         <w:trPr>
@@ -868,7 +915,7 @@
         </w:tc>
         <w:tc>
           <w:tcPr>
-            <w:tcW w:w="2399" w:type="dxa"/>
+            <w:tcW w:w="2398" w:type="dxa"/>
             <w:tcBorders>
               <w:top w:val="single" w:sz="2" w:space="0" w:color="1A7A5E"/>
               <w:start w:val="single" w:sz="2" w:space="0" w:color="1A7A5E"/>
@@ -928,7 +975,7 @@
         </w:tc>
         <w:tc>
           <w:tcPr>
-            <w:tcW w:w="5541" w:type="dxa"/>
+            <w:tcW w:w="5542" w:type="dxa"/>
             <w:tcBorders>
               <w:top w:val="single" w:sz="2" w:space="0" w:color="1A7A5E"/>
               <w:start w:val="single" w:sz="2" w:space="0" w:color="1A7A5E"/>
@@ -995,7 +1042,7 @@
         </w:tc>
         <w:tc>
           <w:tcPr>
-            <w:tcW w:w="2399" w:type="dxa"/>
+            <w:tcW w:w="2398" w:type="dxa"/>
             <w:tcBorders>
               <w:top w:val="single" w:sz="2" w:space="0" w:color="D1D5DB"/>
               <w:start w:val="single" w:sz="2" w:space="0" w:color="D1D5DB"/>
@@ -1052,7 +1099,7 @@
         </w:tc>
         <w:tc>
           <w:tcPr>
-            <w:tcW w:w="5541" w:type="dxa"/>
+            <w:tcW w:w="5542" w:type="dxa"/>
             <w:tcBorders>
               <w:top w:val="single" w:sz="2" w:space="0" w:color="D1D5DB"/>
               <w:start w:val="single" w:sz="2" w:space="0" w:color="D1D5DB"/>
@@ -1116,7 +1163,7 @@
         </w:tc>
         <w:tc>
           <w:tcPr>
-            <w:tcW w:w="2399" w:type="dxa"/>
+            <w:tcW w:w="2398" w:type="dxa"/>
             <w:tcBorders>
               <w:top w:val="single" w:sz="2" w:space="0" w:color="D1D5DB"/>
               <w:start w:val="single" w:sz="2" w:space="0" w:color="D1D5DB"/>
@@ -1173,7 +1220,7 @@
         </w:tc>
         <w:tc>
           <w:tcPr>
-            <w:tcW w:w="5541" w:type="dxa"/>
+            <w:tcW w:w="5542" w:type="dxa"/>
             <w:tcBorders>
               <w:top w:val="single" w:sz="2" w:space="0" w:color="D1D5DB"/>
               <w:start w:val="single" w:sz="2" w:space="0" w:color="D1D5DB"/>
@@ -1237,7 +1284,7 @@
         </w:tc>
         <w:tc>
           <w:tcPr>
-            <w:tcW w:w="2399" w:type="dxa"/>
+            <w:tcW w:w="2398" w:type="dxa"/>
             <w:tcBorders>
               <w:top w:val="single" w:sz="2" w:space="0" w:color="D1D5DB"/>
               <w:start w:val="single" w:sz="2" w:space="0" w:color="D1D5DB"/>
@@ -1294,7 +1341,7 @@
         </w:tc>
         <w:tc>
           <w:tcPr>
-            <w:tcW w:w="5541" w:type="dxa"/>
+            <w:tcW w:w="5542" w:type="dxa"/>
             <w:tcBorders>
               <w:top w:val="single" w:sz="2" w:space="0" w:color="D1D5DB"/>
               <w:start w:val="single" w:sz="2" w:space="0" w:color="D1D5DB"/>
@@ -1358,7 +1405,7 @@
         </w:tc>
         <w:tc>
           <w:tcPr>
-            <w:tcW w:w="2399" w:type="dxa"/>
+            <w:tcW w:w="2398" w:type="dxa"/>
             <w:tcBorders>
               <w:top w:val="single" w:sz="2" w:space="0" w:color="D1D5DB"/>
               <w:start w:val="single" w:sz="2" w:space="0" w:color="D1D5DB"/>
@@ -1415,7 +1462,7 @@
         </w:tc>
         <w:tc>
           <w:tcPr>
-            <w:tcW w:w="5541" w:type="dxa"/>
+            <w:tcW w:w="5542" w:type="dxa"/>
             <w:tcBorders>
               <w:top w:val="single" w:sz="2" w:space="0" w:color="D1D5DB"/>
               <w:start w:val="single" w:sz="2" w:space="0" w:color="D1D5DB"/>
@@ -1479,7 +1526,7 @@
         </w:tc>
         <w:tc>
           <w:tcPr>
-            <w:tcW w:w="2399" w:type="dxa"/>
+            <w:tcW w:w="2398" w:type="dxa"/>
             <w:tcBorders>
               <w:top w:val="single" w:sz="2" w:space="0" w:color="D1D5DB"/>
               <w:start w:val="single" w:sz="2" w:space="0" w:color="D1D5DB"/>
@@ -1536,7 +1583,7 @@
         </w:tc>
         <w:tc>
           <w:tcPr>
-            <w:tcW w:w="5541" w:type="dxa"/>
+            <w:tcW w:w="5542" w:type="dxa"/>
             <w:tcBorders>
               <w:top w:val="single" w:sz="2" w:space="0" w:color="D1D5DB"/>
               <w:start w:val="single" w:sz="2" w:space="0" w:color="D1D5DB"/>
@@ -1600,7 +1647,7 @@
         </w:tc>
         <w:tc>
           <w:tcPr>
-            <w:tcW w:w="2399" w:type="dxa"/>
+            <w:tcW w:w="2398" w:type="dxa"/>
             <w:tcBorders>
               <w:top w:val="single" w:sz="2" w:space="0" w:color="D1D5DB"/>
               <w:start w:val="single" w:sz="2" w:space="0" w:color="D1D5DB"/>
@@ -1657,7 +1704,7 @@
         </w:tc>
         <w:tc>
           <w:tcPr>
-            <w:tcW w:w="5541" w:type="dxa"/>
+            <w:tcW w:w="5542" w:type="dxa"/>
             <w:tcBorders>
               <w:top w:val="single" w:sz="2" w:space="0" w:color="D1D5DB"/>
               <w:start w:val="single" w:sz="2" w:space="0" w:color="D1D5DB"/>
@@ -1721,7 +1768,7 @@
         </w:tc>
         <w:tc>
           <w:tcPr>
-            <w:tcW w:w="2399" w:type="dxa"/>
+            <w:tcW w:w="2398" w:type="dxa"/>
             <w:tcBorders>
               <w:top w:val="single" w:sz="2" w:space="0" w:color="D1D5DB"/>
               <w:start w:val="single" w:sz="2" w:space="0" w:color="D1D5DB"/>
@@ -1778,7 +1825,7 @@
         </w:tc>
         <w:tc>
           <w:tcPr>
-            <w:tcW w:w="5541" w:type="dxa"/>
+            <w:tcW w:w="5542" w:type="dxa"/>
             <w:tcBorders>
               <w:top w:val="single" w:sz="2" w:space="0" w:color="D1D5DB"/>
               <w:start w:val="single" w:sz="2" w:space="0" w:color="D1D5DB"/>
@@ -1821,6 +1868,7 @@
     <w:p>
       <w:pPr>
         <w:pStyle w:val="Normal"/>
+        <w:spacing w:before="0" w:after="0"/>
         <w:rPr/>
       </w:pPr>
       <w:r>
@@ -1838,7 +1886,7 @@
       </w:pPr>
       <w:r>
         <w:rPr>
-          <w:rFonts w:eastAsia="Arial" w:cs="Arial" w:ascii="Arial" w:hAnsi="Arial"/>
+          <w:rFonts w:eastAsia="Arial" w:cs="Arial"/>
           <w:b/>
           <w:bCs/>
           <w:color w:val="0F5540"/>
@@ -1882,7 +1930,7 @@
       </w:pPr>
       <w:r>
         <w:rPr>
-          <w:rFonts w:eastAsia="Arial" w:cs="Arial" w:ascii="Arial" w:hAnsi="Arial"/>
+          <w:rFonts w:eastAsia="Arial" w:cs="Arial"/>
           <w:b/>
           <w:bCs/>
           <w:color w:val="0F5540"/>
@@ -1897,7 +1945,7 @@
         <w:pStyle w:val="ListParagraph"/>
         <w:numPr>
           <w:ilvl w:val="0"/>
-          <w:numId w:val="4"/>
+          <w:numId w:val="6"/>
         </w:numPr>
         <w:spacing w:before="60" w:after="60"/>
         <w:rPr/>
@@ -1928,7 +1976,7 @@
         <w:pStyle w:val="ListParagraph"/>
         <w:numPr>
           <w:ilvl w:val="0"/>
-          <w:numId w:val="1"/>
+          <w:numId w:val="3"/>
         </w:numPr>
         <w:spacing w:before="60" w:after="60"/>
         <w:rPr/>
@@ -1959,7 +2007,7 @@
         <w:pStyle w:val="ListParagraph"/>
         <w:numPr>
           <w:ilvl w:val="0"/>
-          <w:numId w:val="1"/>
+          <w:numId w:val="3"/>
         </w:numPr>
         <w:spacing w:before="60" w:after="60"/>
         <w:rPr/>
@@ -1990,7 +2038,7 @@
         <w:pStyle w:val="ListParagraph"/>
         <w:numPr>
           <w:ilvl w:val="0"/>
-          <w:numId w:val="1"/>
+          <w:numId w:val="3"/>
         </w:numPr>
         <w:spacing w:before="60" w:after="60"/>
         <w:rPr/>
@@ -2021,7 +2069,7 @@
         <w:pStyle w:val="ListParagraph"/>
         <w:numPr>
           <w:ilvl w:val="0"/>
-          <w:numId w:val="1"/>
+          <w:numId w:val="3"/>
         </w:numPr>
         <w:spacing w:before="60" w:after="60"/>
         <w:rPr/>
@@ -2065,7 +2113,7 @@
       </w:pPr>
       <w:r>
         <w:rPr>
-          <w:rFonts w:eastAsia="Arial" w:cs="Arial" w:ascii="Arial" w:hAnsi="Arial"/>
+          <w:rFonts w:eastAsia="Arial" w:cs="Arial"/>
           <w:b/>
           <w:bCs/>
           <w:color w:val="1D4ED8"/>
@@ -2080,7 +2128,7 @@
         <w:pStyle w:val="ListParagraph"/>
         <w:numPr>
           <w:ilvl w:val="0"/>
-          <w:numId w:val="1"/>
+          <w:numId w:val="3"/>
         </w:numPr>
         <w:spacing w:before="60" w:after="60"/>
         <w:rPr/>
@@ -2111,7 +2159,7 @@
         <w:pStyle w:val="ListParagraph"/>
         <w:numPr>
           <w:ilvl w:val="0"/>
-          <w:numId w:val="1"/>
+          <w:numId w:val="3"/>
         </w:numPr>
         <w:spacing w:before="60" w:after="60"/>
         <w:rPr/>
@@ -2142,7 +2190,7 @@
         <w:pStyle w:val="ListParagraph"/>
         <w:numPr>
           <w:ilvl w:val="0"/>
-          <w:numId w:val="1"/>
+          <w:numId w:val="3"/>
         </w:numPr>
         <w:spacing w:before="60" w:after="60"/>
         <w:rPr/>
@@ -2173,7 +2221,7 @@
         <w:pStyle w:val="ListParagraph"/>
         <w:numPr>
           <w:ilvl w:val="0"/>
-          <w:numId w:val="1"/>
+          <w:numId w:val="3"/>
         </w:numPr>
         <w:spacing w:before="60" w:after="60"/>
         <w:rPr/>
@@ -2217,7 +2265,7 @@
       </w:pPr>
       <w:r>
         <w:rPr>
-          <w:rFonts w:eastAsia="Arial" w:cs="Arial" w:ascii="Arial" w:hAnsi="Arial"/>
+          <w:rFonts w:eastAsia="Arial" w:cs="Arial"/>
           <w:b/>
           <w:bCs/>
           <w:color w:val="4C3A99"/>
@@ -2232,7 +2280,7 @@
         <w:pStyle w:val="ListParagraph"/>
         <w:numPr>
           <w:ilvl w:val="0"/>
-          <w:numId w:val="1"/>
+          <w:numId w:val="3"/>
         </w:numPr>
         <w:spacing w:before="60" w:after="60"/>
         <w:rPr/>
@@ -2263,7 +2311,7 @@
         <w:pStyle w:val="ListParagraph"/>
         <w:numPr>
           <w:ilvl w:val="0"/>
-          <w:numId w:val="1"/>
+          <w:numId w:val="3"/>
         </w:numPr>
         <w:spacing w:before="60" w:after="60"/>
         <w:rPr/>
@@ -2294,7 +2342,7 @@
         <w:pStyle w:val="ListParagraph"/>
         <w:numPr>
           <w:ilvl w:val="0"/>
-          <w:numId w:val="1"/>
+          <w:numId w:val="3"/>
         </w:numPr>
         <w:spacing w:before="60" w:after="60"/>
         <w:rPr/>
@@ -2325,7 +2373,7 @@
         <w:pStyle w:val="ListParagraph"/>
         <w:numPr>
           <w:ilvl w:val="0"/>
-          <w:numId w:val="1"/>
+          <w:numId w:val="3"/>
         </w:numPr>
         <w:spacing w:before="60" w:after="60"/>
         <w:rPr/>
@@ -2356,7 +2404,7 @@
         <w:pStyle w:val="ListParagraph"/>
         <w:numPr>
           <w:ilvl w:val="0"/>
-          <w:numId w:val="1"/>
+          <w:numId w:val="3"/>
         </w:numPr>
         <w:spacing w:before="60" w:after="60"/>
         <w:rPr/>
@@ -2387,7 +2435,7 @@
         <w:pStyle w:val="ListParagraph"/>
         <w:numPr>
           <w:ilvl w:val="0"/>
-          <w:numId w:val="1"/>
+          <w:numId w:val="3"/>
         </w:numPr>
         <w:spacing w:before="60" w:after="60"/>
         <w:rPr/>
@@ -2431,7 +2479,7 @@
       </w:pPr>
       <w:r>
         <w:rPr>
-          <w:rFonts w:eastAsia="Arial" w:cs="Arial" w:ascii="Arial" w:hAnsi="Arial"/>
+          <w:rFonts w:eastAsia="Arial" w:cs="Arial"/>
           <w:b/>
           <w:bCs/>
           <w:color w:val="B45309"/>
@@ -2446,7 +2494,7 @@
         <w:pStyle w:val="ListParagraph"/>
         <w:numPr>
           <w:ilvl w:val="0"/>
-          <w:numId w:val="1"/>
+          <w:numId w:val="3"/>
         </w:numPr>
         <w:spacing w:before="60" w:after="60"/>
         <w:rPr/>
@@ -2477,7 +2525,7 @@
         <w:pStyle w:val="ListParagraph"/>
         <w:numPr>
           <w:ilvl w:val="0"/>
-          <w:numId w:val="1"/>
+          <w:numId w:val="3"/>
         </w:numPr>
         <w:spacing w:before="60" w:after="60"/>
         <w:rPr/>
@@ -2508,7 +2556,7 @@
         <w:pStyle w:val="ListParagraph"/>
         <w:numPr>
           <w:ilvl w:val="0"/>
-          <w:numId w:val="1"/>
+          <w:numId w:val="3"/>
         </w:numPr>
         <w:spacing w:before="60" w:after="60"/>
         <w:rPr/>
@@ -2539,7 +2587,7 @@
         <w:pStyle w:val="ListParagraph"/>
         <w:numPr>
           <w:ilvl w:val="0"/>
-          <w:numId w:val="1"/>
+          <w:numId w:val="3"/>
         </w:numPr>
         <w:spacing w:before="60" w:after="60"/>
         <w:rPr/>
@@ -2570,7 +2618,7 @@
         <w:pStyle w:val="ListParagraph"/>
         <w:numPr>
           <w:ilvl w:val="0"/>
-          <w:numId w:val="1"/>
+          <w:numId w:val="3"/>
         </w:numPr>
         <w:spacing w:before="60" w:after="60"/>
         <w:rPr/>
@@ -2614,7 +2662,7 @@
       </w:pPr>
       <w:r>
         <w:rPr>
-          <w:rFonts w:eastAsia="Arial" w:cs="Arial" w:ascii="Arial" w:hAnsi="Arial"/>
+          <w:rFonts w:eastAsia="Arial" w:cs="Arial"/>
           <w:b/>
           <w:bCs/>
           <w:color w:val="991B1B"/>
@@ -2629,7 +2677,7 @@
         <w:pStyle w:val="ListParagraph"/>
         <w:numPr>
           <w:ilvl w:val="0"/>
-          <w:numId w:val="1"/>
+          <w:numId w:val="3"/>
         </w:numPr>
         <w:spacing w:before="60" w:after="60"/>
         <w:rPr/>
@@ -2660,7 +2708,7 @@
         <w:pStyle w:val="ListParagraph"/>
         <w:numPr>
           <w:ilvl w:val="0"/>
-          <w:numId w:val="1"/>
+          <w:numId w:val="3"/>
         </w:numPr>
         <w:spacing w:before="60" w:after="60"/>
         <w:rPr/>
@@ -2691,7 +2739,7 @@
         <w:pStyle w:val="ListParagraph"/>
         <w:numPr>
           <w:ilvl w:val="0"/>
-          <w:numId w:val="1"/>
+          <w:numId w:val="3"/>
         </w:numPr>
         <w:spacing w:before="60" w:after="60"/>
         <w:rPr/>
@@ -2722,7 +2770,7 @@
         <w:pStyle w:val="ListParagraph"/>
         <w:numPr>
           <w:ilvl w:val="0"/>
-          <w:numId w:val="1"/>
+          <w:numId w:val="3"/>
         </w:numPr>
         <w:spacing w:before="60" w:after="60"/>
         <w:rPr/>
@@ -2766,7 +2814,7 @@
       </w:pPr>
       <w:r>
         <w:rPr>
-          <w:rFonts w:eastAsia="Arial" w:cs="Arial" w:ascii="Arial" w:hAnsi="Arial"/>
+          <w:rFonts w:eastAsia="Arial" w:cs="Arial"/>
           <w:b/>
           <w:bCs/>
           <w:color w:val="9A3412"/>
@@ -2781,7 +2829,7 @@
         <w:pStyle w:val="ListParagraph"/>
         <w:numPr>
           <w:ilvl w:val="0"/>
-          <w:numId w:val="1"/>
+          <w:numId w:val="3"/>
         </w:numPr>
         <w:spacing w:before="60" w:after="60"/>
         <w:rPr/>
@@ -2812,7 +2860,7 @@
         <w:pStyle w:val="ListParagraph"/>
         <w:numPr>
           <w:ilvl w:val="0"/>
-          <w:numId w:val="1"/>
+          <w:numId w:val="3"/>
         </w:numPr>
         <w:spacing w:before="60" w:after="60"/>
         <w:rPr/>
@@ -2843,7 +2891,7 @@
         <w:pStyle w:val="ListParagraph"/>
         <w:numPr>
           <w:ilvl w:val="0"/>
-          <w:numId w:val="1"/>
+          <w:numId w:val="3"/>
         </w:numPr>
         <w:spacing w:before="60" w:after="60"/>
         <w:rPr/>
@@ -2874,7 +2922,7 @@
         <w:pStyle w:val="ListParagraph"/>
         <w:numPr>
           <w:ilvl w:val="0"/>
-          <w:numId w:val="1"/>
+          <w:numId w:val="3"/>
         </w:numPr>
         <w:spacing w:before="60" w:after="60"/>
         <w:rPr/>
@@ -2918,7 +2966,7 @@
       </w:pPr>
       <w:r>
         <w:rPr>
-          <w:rFonts w:eastAsia="Arial" w:cs="Arial" w:ascii="Arial" w:hAnsi="Arial"/>
+          <w:rFonts w:eastAsia="Arial" w:cs="Arial"/>
           <w:b/>
           <w:bCs/>
           <w:color w:val="374151"/>
@@ -2933,7 +2981,7 @@
         <w:pStyle w:val="ListParagraph"/>
         <w:numPr>
           <w:ilvl w:val="0"/>
-          <w:numId w:val="1"/>
+          <w:numId w:val="3"/>
         </w:numPr>
         <w:spacing w:before="60" w:after="60"/>
         <w:rPr/>
@@ -2964,7 +3012,7 @@
         <w:pStyle w:val="ListParagraph"/>
         <w:numPr>
           <w:ilvl w:val="0"/>
-          <w:numId w:val="1"/>
+          <w:numId w:val="3"/>
         </w:numPr>
         <w:spacing w:before="60" w:after="60"/>
         <w:rPr/>
@@ -2995,7 +3043,7 @@
         <w:pStyle w:val="ListParagraph"/>
         <w:numPr>
           <w:ilvl w:val="0"/>
-          <w:numId w:val="1"/>
+          <w:numId w:val="3"/>
         </w:numPr>
         <w:spacing w:before="60" w:after="60"/>
         <w:rPr/>
@@ -3026,7 +3074,7 @@
         <w:pStyle w:val="ListParagraph"/>
         <w:numPr>
           <w:ilvl w:val="0"/>
-          <w:numId w:val="1"/>
+          <w:numId w:val="3"/>
         </w:numPr>
         <w:spacing w:before="60" w:after="60"/>
         <w:rPr/>
@@ -3073,7 +3121,7 @@
       </w:pPr>
       <w:r>
         <w:rPr>
-          <w:rFonts w:eastAsia="Arial" w:cs="Arial" w:ascii="Arial" w:hAnsi="Arial"/>
+          <w:rFonts w:eastAsia="Arial" w:cs="Arial"/>
           <w:b/>
           <w:bCs/>
           <w:color w:val="0F5540"/>
@@ -3097,14 +3145,14 @@
         </w:tblCellMar>
       </w:tblPr>
       <w:tblGrid>
-        <w:gridCol w:w="2160"/>
-        <w:gridCol w:w="7560"/>
+        <w:gridCol w:w="2159"/>
+        <w:gridCol w:w="7561"/>
       </w:tblGrid>
       <w:tr>
         <w:trPr/>
         <w:tc>
           <w:tcPr>
-            <w:tcW w:w="2160" w:type="dxa"/>
+            <w:tcW w:w="2159" w:type="dxa"/>
             <w:tcBorders/>
             <w:shd w:fill="EEEDFE" w:val="clear"/>
             <w:vAlign w:val="center"/>
@@ -3130,7 +3178,7 @@
         </w:tc>
         <w:tc>
           <w:tcPr>
-            <w:tcW w:w="7560" w:type="dxa"/>
+            <w:tcW w:w="7561" w:type="dxa"/>
             <w:tcBorders/>
             <w:shd w:fill="EEEDFE" w:val="clear"/>
             <w:tcMar>
@@ -3570,7 +3618,7 @@
         <w:pStyle w:val="ListParagraph"/>
         <w:numPr>
           <w:ilvl w:val="0"/>
-          <w:numId w:val="1"/>
+          <w:numId w:val="3"/>
         </w:numPr>
         <w:spacing w:before="60" w:after="60"/>
         <w:rPr/>
@@ -3590,7 +3638,7 @@
         <w:pStyle w:val="ListParagraph"/>
         <w:numPr>
           <w:ilvl w:val="0"/>
-          <w:numId w:val="1"/>
+          <w:numId w:val="3"/>
         </w:numPr>
         <w:spacing w:before="60" w:after="60"/>
         <w:rPr/>
@@ -3610,7 +3658,7 @@
         <w:pStyle w:val="ListParagraph"/>
         <w:numPr>
           <w:ilvl w:val="0"/>
-          <w:numId w:val="1"/>
+          <w:numId w:val="3"/>
         </w:numPr>
         <w:spacing w:before="60" w:after="60"/>
         <w:rPr/>
@@ -3630,7 +3678,7 @@
         <w:pStyle w:val="ListParagraph"/>
         <w:numPr>
           <w:ilvl w:val="0"/>
-          <w:numId w:val="1"/>
+          <w:numId w:val="3"/>
         </w:numPr>
         <w:spacing w:before="60" w:after="60"/>
         <w:rPr/>
@@ -3650,7 +3698,7 @@
         <w:pStyle w:val="ListParagraph"/>
         <w:numPr>
           <w:ilvl w:val="0"/>
-          <w:numId w:val="1"/>
+          <w:numId w:val="3"/>
         </w:numPr>
         <w:spacing w:before="60" w:after="60"/>
         <w:rPr/>
@@ -3670,7 +3718,7 @@
         <w:pStyle w:val="ListParagraph"/>
         <w:numPr>
           <w:ilvl w:val="0"/>
-          <w:numId w:val="1"/>
+          <w:numId w:val="3"/>
         </w:numPr>
         <w:spacing w:before="60" w:after="60"/>
         <w:rPr/>
@@ -4073,14 +4121,14 @@
         </w:tblCellMar>
       </w:tblPr>
       <w:tblGrid>
-        <w:gridCol w:w="1530"/>
-        <w:gridCol w:w="8190"/>
+        <w:gridCol w:w="1529"/>
+        <w:gridCol w:w="8191"/>
       </w:tblGrid>
       <w:tr>
         <w:trPr/>
         <w:tc>
           <w:tcPr>
-            <w:tcW w:w="1530" w:type="dxa"/>
+            <w:tcW w:w="1529" w:type="dxa"/>
             <w:tcBorders/>
             <w:shd w:fill="FEF3C7" w:val="clear"/>
           </w:tcPr>
@@ -4116,7 +4164,7 @@
         </w:tc>
         <w:tc>
           <w:tcPr>
-            <w:tcW w:w="8190" w:type="dxa"/>
+            <w:tcW w:w="8191" w:type="dxa"/>
             <w:tcBorders/>
             <w:shd w:fill="FEF3C7" w:val="clear"/>
             <w:tcMar>
@@ -4159,6 +4207,7 @@
     <w:p>
       <w:pPr>
         <w:pStyle w:val="Normal"/>
+        <w:spacing w:before="0" w:after="0"/>
         <w:rPr/>
       </w:pPr>
       <w:r>
@@ -4176,7 +4225,7 @@
       </w:pPr>
       <w:r>
         <w:rPr>
-          <w:rFonts w:eastAsia="Arial" w:cs="Arial" w:ascii="Arial" w:hAnsi="Arial"/>
+          <w:rFonts w:eastAsia="Arial" w:cs="Arial"/>
           <w:b/>
           <w:bCs/>
           <w:color w:val="0F5540"/>
@@ -4673,7 +4722,7 @@
         <w:pStyle w:val="ListParagraph"/>
         <w:numPr>
           <w:ilvl w:val="0"/>
-          <w:numId w:val="1"/>
+          <w:numId w:val="3"/>
         </w:numPr>
         <w:spacing w:before="60" w:after="60"/>
         <w:rPr/>
@@ -4693,7 +4742,7 @@
         <w:pStyle w:val="ListParagraph"/>
         <w:numPr>
           <w:ilvl w:val="0"/>
-          <w:numId w:val="1"/>
+          <w:numId w:val="3"/>
         </w:numPr>
         <w:spacing w:before="60" w:after="60"/>
         <w:rPr/>
@@ -4713,7 +4762,7 @@
         <w:pStyle w:val="ListParagraph"/>
         <w:numPr>
           <w:ilvl w:val="0"/>
-          <w:numId w:val="1"/>
+          <w:numId w:val="3"/>
         </w:numPr>
         <w:spacing w:before="60" w:after="60"/>
         <w:rPr/>
@@ -4733,7 +4782,7 @@
         <w:pStyle w:val="ListParagraph"/>
         <w:numPr>
           <w:ilvl w:val="0"/>
-          <w:numId w:val="1"/>
+          <w:numId w:val="3"/>
         </w:numPr>
         <w:spacing w:before="60" w:after="60"/>
         <w:rPr/>
@@ -4753,7 +4802,7 @@
         <w:pStyle w:val="ListParagraph"/>
         <w:numPr>
           <w:ilvl w:val="0"/>
-          <w:numId w:val="1"/>
+          <w:numId w:val="3"/>
         </w:numPr>
         <w:spacing w:before="60" w:after="60"/>
         <w:rPr/>
@@ -4773,7 +4822,7 @@
         <w:pStyle w:val="ListParagraph"/>
         <w:numPr>
           <w:ilvl w:val="0"/>
-          <w:numId w:val="1"/>
+          <w:numId w:val="3"/>
         </w:numPr>
         <w:spacing w:before="60" w:after="60"/>
         <w:rPr/>
@@ -5273,6 +5322,7 @@
     <w:p>
       <w:pPr>
         <w:pStyle w:val="Normal"/>
+        <w:spacing w:before="0" w:after="0"/>
         <w:rPr/>
       </w:pPr>
       <w:r>
@@ -5290,7 +5340,7 @@
       </w:pPr>
       <w:r>
         <w:rPr>
-          <w:rFonts w:eastAsia="Arial" w:cs="Arial" w:ascii="Arial" w:hAnsi="Arial"/>
+          <w:rFonts w:eastAsia="Arial" w:cs="Arial"/>
           <w:b/>
           <w:bCs/>
           <w:color w:val="0F5540"/>
@@ -5314,14 +5364,14 @@
         </w:tblCellMar>
       </w:tblPr>
       <w:tblGrid>
-        <w:gridCol w:w="2160"/>
-        <w:gridCol w:w="7560"/>
+        <w:gridCol w:w="2159"/>
+        <w:gridCol w:w="7561"/>
       </w:tblGrid>
       <w:tr>
         <w:trPr/>
         <w:tc>
           <w:tcPr>
-            <w:tcW w:w="2160" w:type="dxa"/>
+            <w:tcW w:w="2159" w:type="dxa"/>
             <w:tcBorders/>
             <w:shd w:fill="E6F1FB" w:val="clear"/>
             <w:vAlign w:val="center"/>
@@ -5347,7 +5397,7 @@
         </w:tc>
         <w:tc>
           <w:tcPr>
-            <w:tcW w:w="7560" w:type="dxa"/>
+            <w:tcW w:w="7561" w:type="dxa"/>
             <w:tcBorders/>
             <w:shd w:fill="E6F1FB" w:val="clear"/>
             <w:tcMar>
@@ -5787,7 +5837,7 @@
         <w:pStyle w:val="ListParagraph"/>
         <w:numPr>
           <w:ilvl w:val="0"/>
-          <w:numId w:val="1"/>
+          <w:numId w:val="3"/>
         </w:numPr>
         <w:spacing w:before="60" w:after="60"/>
         <w:rPr/>
@@ -5807,7 +5857,7 @@
         <w:pStyle w:val="ListParagraph"/>
         <w:numPr>
           <w:ilvl w:val="0"/>
-          <w:numId w:val="1"/>
+          <w:numId w:val="3"/>
         </w:numPr>
         <w:spacing w:before="60" w:after="60"/>
         <w:rPr/>
@@ -5827,7 +5877,7 @@
         <w:pStyle w:val="ListParagraph"/>
         <w:numPr>
           <w:ilvl w:val="0"/>
-          <w:numId w:val="1"/>
+          <w:numId w:val="3"/>
         </w:numPr>
         <w:spacing w:before="60" w:after="60"/>
         <w:rPr/>
@@ -5847,7 +5897,7 @@
         <w:pStyle w:val="ListParagraph"/>
         <w:numPr>
           <w:ilvl w:val="0"/>
-          <w:numId w:val="1"/>
+          <w:numId w:val="3"/>
         </w:numPr>
         <w:spacing w:before="60" w:after="60"/>
         <w:rPr/>
@@ -5867,7 +5917,7 @@
         <w:pStyle w:val="ListParagraph"/>
         <w:numPr>
           <w:ilvl w:val="0"/>
-          <w:numId w:val="1"/>
+          <w:numId w:val="3"/>
         </w:numPr>
         <w:spacing w:before="60" w:after="60"/>
         <w:rPr/>
@@ -5887,7 +5937,7 @@
         <w:pStyle w:val="ListParagraph"/>
         <w:numPr>
           <w:ilvl w:val="0"/>
-          <w:numId w:val="1"/>
+          <w:numId w:val="3"/>
         </w:numPr>
         <w:spacing w:before="60" w:after="60"/>
         <w:rPr/>
@@ -6290,8 +6340,8 @@
         </w:tblCellMar>
       </w:tblPr>
       <w:tblGrid>
-        <w:gridCol w:w="1890"/>
-        <w:gridCol w:w="7830"/>
+        <w:gridCol w:w="1889"/>
+        <w:gridCol w:w="7831"/>
       </w:tblGrid>
       <w:tr>
         <w:trPr>
@@ -6299,7 +6349,7 @@
         </w:trPr>
         <w:tc>
           <w:tcPr>
-            <w:tcW w:w="1890" w:type="dxa"/>
+            <w:tcW w:w="1889" w:type="dxa"/>
             <w:tcBorders/>
             <w:shd w:fill="FEF3C7" w:val="clear"/>
           </w:tcPr>
@@ -6366,7 +6416,7 @@
         </w:tc>
         <w:tc>
           <w:tcPr>
-            <w:tcW w:w="7830" w:type="dxa"/>
+            <w:tcW w:w="7831" w:type="dxa"/>
             <w:tcBorders/>
             <w:shd w:fill="FEF3C7" w:val="clear"/>
             <w:tcMar>
@@ -6409,6 +6459,7 @@
     <w:p>
       <w:pPr>
         <w:pStyle w:val="Normal"/>
+        <w:spacing w:before="0" w:after="0"/>
         <w:rPr/>
       </w:pPr>
       <w:r>
@@ -6426,7 +6477,7 @@
       </w:pPr>
       <w:r>
         <w:rPr>
-          <w:rFonts w:eastAsia="Arial" w:cs="Arial" w:ascii="Arial" w:hAnsi="Arial"/>
+          <w:rFonts w:eastAsia="Arial" w:cs="Arial"/>
           <w:b/>
           <w:bCs/>
           <w:color w:val="0F5540"/>
@@ -6450,14 +6501,14 @@
         </w:tblCellMar>
       </w:tblPr>
       <w:tblGrid>
-        <w:gridCol w:w="2340"/>
-        <w:gridCol w:w="7380"/>
+        <w:gridCol w:w="2339"/>
+        <w:gridCol w:w="7381"/>
       </w:tblGrid>
       <w:tr>
         <w:trPr/>
         <w:tc>
           <w:tcPr>
-            <w:tcW w:w="2340" w:type="dxa"/>
+            <w:tcW w:w="2339" w:type="dxa"/>
             <w:tcBorders/>
             <w:shd w:fill="FAEEDA" w:val="clear"/>
             <w:vAlign w:val="center"/>
@@ -6483,7 +6534,7 @@
         </w:tc>
         <w:tc>
           <w:tcPr>
-            <w:tcW w:w="7380" w:type="dxa"/>
+            <w:tcW w:w="7381" w:type="dxa"/>
             <w:tcBorders/>
             <w:shd w:fill="FAEEDA" w:val="clear"/>
             <w:tcMar>
@@ -6923,7 +6974,7 @@
         <w:pStyle w:val="ListParagraph"/>
         <w:numPr>
           <w:ilvl w:val="0"/>
-          <w:numId w:val="1"/>
+          <w:numId w:val="3"/>
         </w:numPr>
         <w:spacing w:before="60" w:after="60"/>
         <w:rPr/>
@@ -6943,7 +6994,7 @@
         <w:pStyle w:val="ListParagraph"/>
         <w:numPr>
           <w:ilvl w:val="0"/>
-          <w:numId w:val="1"/>
+          <w:numId w:val="3"/>
         </w:numPr>
         <w:spacing w:before="60" w:after="60"/>
         <w:rPr/>
@@ -6963,7 +7014,7 @@
         <w:pStyle w:val="ListParagraph"/>
         <w:numPr>
           <w:ilvl w:val="0"/>
-          <w:numId w:val="1"/>
+          <w:numId w:val="3"/>
         </w:numPr>
         <w:spacing w:before="60" w:after="60"/>
         <w:rPr/>
@@ -6983,7 +7034,7 @@
         <w:pStyle w:val="ListParagraph"/>
         <w:numPr>
           <w:ilvl w:val="0"/>
-          <w:numId w:val="1"/>
+          <w:numId w:val="3"/>
         </w:numPr>
         <w:spacing w:before="60" w:after="60"/>
         <w:rPr/>
@@ -7003,7 +7054,7 @@
         <w:pStyle w:val="ListParagraph"/>
         <w:numPr>
           <w:ilvl w:val="0"/>
-          <w:numId w:val="1"/>
+          <w:numId w:val="3"/>
         </w:numPr>
         <w:spacing w:before="60" w:after="60"/>
         <w:rPr/>
@@ -7406,14 +7457,14 @@
         </w:tblCellMar>
       </w:tblPr>
       <w:tblGrid>
-        <w:gridCol w:w="1845"/>
-        <w:gridCol w:w="7875"/>
+        <w:gridCol w:w="1844"/>
+        <w:gridCol w:w="7876"/>
       </w:tblGrid>
       <w:tr>
         <w:trPr/>
         <w:tc>
           <w:tcPr>
-            <w:tcW w:w="1845" w:type="dxa"/>
+            <w:tcW w:w="1844" w:type="dxa"/>
             <w:tcBorders/>
             <w:shd w:fill="FEF3C7" w:val="clear"/>
           </w:tcPr>
@@ -7480,7 +7531,7 @@
         </w:tc>
         <w:tc>
           <w:tcPr>
-            <w:tcW w:w="7875" w:type="dxa"/>
+            <w:tcW w:w="7876" w:type="dxa"/>
             <w:tcBorders/>
             <w:shd w:fill="FEF3C7" w:val="clear"/>
             <w:tcMar>
@@ -7523,6 +7574,7 @@
     <w:p>
       <w:pPr>
         <w:pStyle w:val="Normal"/>
+        <w:spacing w:before="0" w:after="0"/>
         <w:rPr/>
       </w:pPr>
       <w:r>
@@ -7540,7 +7592,7 @@
       </w:pPr>
       <w:r>
         <w:rPr>
-          <w:rFonts w:eastAsia="Arial" w:cs="Arial" w:ascii="Arial" w:hAnsi="Arial"/>
+          <w:rFonts w:eastAsia="Arial" w:cs="Arial"/>
           <w:b/>
           <w:bCs/>
           <w:color w:val="0F5540"/>
@@ -8037,7 +8089,7 @@
         <w:pStyle w:val="ListParagraph"/>
         <w:numPr>
           <w:ilvl w:val="0"/>
-          <w:numId w:val="1"/>
+          <w:numId w:val="3"/>
         </w:numPr>
         <w:spacing w:before="60" w:after="60"/>
         <w:rPr/>
@@ -8057,7 +8109,7 @@
         <w:pStyle w:val="ListParagraph"/>
         <w:numPr>
           <w:ilvl w:val="0"/>
-          <w:numId w:val="1"/>
+          <w:numId w:val="3"/>
         </w:numPr>
         <w:spacing w:before="60" w:after="60"/>
         <w:rPr/>
@@ -8077,7 +8129,7 @@
         <w:pStyle w:val="ListParagraph"/>
         <w:numPr>
           <w:ilvl w:val="0"/>
-          <w:numId w:val="1"/>
+          <w:numId w:val="3"/>
         </w:numPr>
         <w:spacing w:before="60" w:after="60"/>
         <w:rPr/>
@@ -8097,7 +8149,7 @@
         <w:pStyle w:val="ListParagraph"/>
         <w:numPr>
           <w:ilvl w:val="0"/>
-          <w:numId w:val="1"/>
+          <w:numId w:val="3"/>
         </w:numPr>
         <w:spacing w:before="60" w:after="60"/>
         <w:rPr/>
@@ -8117,7 +8169,7 @@
         <w:pStyle w:val="ListParagraph"/>
         <w:numPr>
           <w:ilvl w:val="0"/>
-          <w:numId w:val="1"/>
+          <w:numId w:val="3"/>
         </w:numPr>
         <w:spacing w:before="60" w:after="60"/>
         <w:rPr/>
@@ -8648,6 +8700,7 @@
     <w:p>
       <w:pPr>
         <w:pStyle w:val="Normal"/>
+        <w:spacing w:before="0" w:after="0"/>
         <w:rPr/>
       </w:pPr>
       <w:r>
@@ -8665,7 +8718,7 @@
       </w:pPr>
       <w:r>
         <w:rPr>
-          <w:rFonts w:eastAsia="Arial" w:cs="Arial" w:ascii="Arial" w:hAnsi="Arial"/>
+          <w:rFonts w:eastAsia="Arial" w:cs="Arial"/>
           <w:b/>
           <w:bCs/>
           <w:color w:val="0F5540"/>
@@ -8689,14 +8742,14 @@
         </w:tblCellMar>
       </w:tblPr>
       <w:tblGrid>
-        <w:gridCol w:w="2610"/>
-        <w:gridCol w:w="7110"/>
+        <w:gridCol w:w="2609"/>
+        <w:gridCol w:w="7111"/>
       </w:tblGrid>
       <w:tr>
         <w:trPr/>
         <w:tc>
           <w:tcPr>
-            <w:tcW w:w="2610" w:type="dxa"/>
+            <w:tcW w:w="2609" w:type="dxa"/>
             <w:tcBorders/>
             <w:shd w:fill="FBEAF0" w:val="clear"/>
             <w:vAlign w:val="center"/>
@@ -8722,7 +8775,7 @@
         </w:tc>
         <w:tc>
           <w:tcPr>
-            <w:tcW w:w="7110" w:type="dxa"/>
+            <w:tcW w:w="7111" w:type="dxa"/>
             <w:tcBorders/>
             <w:shd w:fill="FBEAF0" w:val="clear"/>
             <w:tcMar>
@@ -9162,7 +9215,7 @@
         <w:pStyle w:val="ListParagraph"/>
         <w:numPr>
           <w:ilvl w:val="0"/>
-          <w:numId w:val="1"/>
+          <w:numId w:val="3"/>
         </w:numPr>
         <w:spacing w:before="60" w:after="60"/>
         <w:rPr/>
@@ -9182,7 +9235,7 @@
         <w:pStyle w:val="ListParagraph"/>
         <w:numPr>
           <w:ilvl w:val="0"/>
-          <w:numId w:val="1"/>
+          <w:numId w:val="3"/>
         </w:numPr>
         <w:spacing w:before="60" w:after="60"/>
         <w:rPr/>
@@ -9202,7 +9255,7 @@
         <w:pStyle w:val="ListParagraph"/>
         <w:numPr>
           <w:ilvl w:val="0"/>
-          <w:numId w:val="1"/>
+          <w:numId w:val="3"/>
         </w:numPr>
         <w:spacing w:before="60" w:after="60"/>
         <w:rPr/>
@@ -9222,7 +9275,7 @@
         <w:pStyle w:val="ListParagraph"/>
         <w:numPr>
           <w:ilvl w:val="0"/>
-          <w:numId w:val="1"/>
+          <w:numId w:val="3"/>
         </w:numPr>
         <w:spacing w:before="60" w:after="60"/>
         <w:rPr/>
@@ -9242,7 +9295,7 @@
         <w:pStyle w:val="ListParagraph"/>
         <w:numPr>
           <w:ilvl w:val="0"/>
-          <w:numId w:val="1"/>
+          <w:numId w:val="3"/>
         </w:numPr>
         <w:spacing w:before="60" w:after="60"/>
         <w:rPr/>
@@ -9262,7 +9315,7 @@
         <w:pStyle w:val="ListParagraph"/>
         <w:numPr>
           <w:ilvl w:val="0"/>
-          <w:numId w:val="1"/>
+          <w:numId w:val="3"/>
         </w:numPr>
         <w:spacing w:before="60" w:after="60"/>
         <w:rPr/>
@@ -9676,14 +9729,14 @@
         </w:tblCellMar>
       </w:tblPr>
       <w:tblGrid>
-        <w:gridCol w:w="1890"/>
-        <w:gridCol w:w="7830"/>
+        <w:gridCol w:w="1889"/>
+        <w:gridCol w:w="7831"/>
       </w:tblGrid>
       <w:tr>
         <w:trPr/>
         <w:tc>
           <w:tcPr>
-            <w:tcW w:w="1890" w:type="dxa"/>
+            <w:tcW w:w="1889" w:type="dxa"/>
             <w:tcBorders/>
             <w:shd w:fill="FEF3C7" w:val="clear"/>
           </w:tcPr>
@@ -9750,7 +9803,7 @@
         </w:tc>
         <w:tc>
           <w:tcPr>
-            <w:tcW w:w="7830" w:type="dxa"/>
+            <w:tcW w:w="7831" w:type="dxa"/>
             <w:tcBorders/>
             <w:shd w:fill="FEF3C7" w:val="clear"/>
             <w:tcMar>
@@ -9793,6 +9846,7 @@
     <w:p>
       <w:pPr>
         <w:pStyle w:val="Normal"/>
+        <w:spacing w:before="0" w:after="0"/>
         <w:rPr/>
       </w:pPr>
       <w:r>
@@ -9810,7 +9864,7 @@
       </w:pPr>
       <w:r>
         <w:rPr>
-          <w:rFonts w:eastAsia="Arial" w:cs="Arial" w:ascii="Arial" w:hAnsi="Arial"/>
+          <w:rFonts w:eastAsia="Arial" w:cs="Arial"/>
           <w:b/>
           <w:bCs/>
           <w:color w:val="0F5540"/>
@@ -10219,7 +10273,7 @@
         <w:pStyle w:val="ListParagraph"/>
         <w:numPr>
           <w:ilvl w:val="0"/>
-          <w:numId w:val="1"/>
+          <w:numId w:val="3"/>
         </w:numPr>
         <w:spacing w:before="60" w:after="60"/>
         <w:rPr/>
@@ -10239,7 +10293,7 @@
         <w:pStyle w:val="ListParagraph"/>
         <w:numPr>
           <w:ilvl w:val="0"/>
-          <w:numId w:val="1"/>
+          <w:numId w:val="3"/>
         </w:numPr>
         <w:spacing w:before="60" w:after="60"/>
         <w:rPr/>
@@ -10259,7 +10313,7 @@
         <w:pStyle w:val="ListParagraph"/>
         <w:numPr>
           <w:ilvl w:val="0"/>
-          <w:numId w:val="1"/>
+          <w:numId w:val="3"/>
         </w:numPr>
         <w:spacing w:before="60" w:after="60"/>
         <w:rPr/>
@@ -10279,7 +10333,7 @@
         <w:pStyle w:val="ListParagraph"/>
         <w:numPr>
           <w:ilvl w:val="0"/>
-          <w:numId w:val="1"/>
+          <w:numId w:val="3"/>
         </w:numPr>
         <w:spacing w:before="60" w:after="60"/>
         <w:rPr/>
@@ -10793,14 +10847,14 @@
         </w:tblCellMar>
       </w:tblPr>
       <w:tblGrid>
-        <w:gridCol w:w="1845"/>
-        <w:gridCol w:w="7875"/>
+        <w:gridCol w:w="1844"/>
+        <w:gridCol w:w="7876"/>
       </w:tblGrid>
       <w:tr>
         <w:trPr/>
         <w:tc>
           <w:tcPr>
-            <w:tcW w:w="1845" w:type="dxa"/>
+            <w:tcW w:w="1844" w:type="dxa"/>
             <w:tcBorders/>
             <w:shd w:fill="FEF3C7" w:val="clear"/>
           </w:tcPr>
@@ -10843,7 +10897,7 @@
         </w:tc>
         <w:tc>
           <w:tcPr>
-            <w:tcW w:w="7875" w:type="dxa"/>
+            <w:tcW w:w="7876" w:type="dxa"/>
             <w:tcBorders/>
             <w:shd w:fill="FEF3C7" w:val="clear"/>
             <w:tcMar>
@@ -10886,6 +10940,7 @@
     <w:p>
       <w:pPr>
         <w:pStyle w:val="Normal"/>
+        <w:spacing w:before="0" w:after="0"/>
         <w:rPr/>
       </w:pPr>
       <w:r>
@@ -10903,7 +10958,7 @@
       </w:pPr>
       <w:r>
         <w:rPr>
-          <w:rFonts w:eastAsia="Arial" w:cs="Arial" w:ascii="Arial" w:hAnsi="Arial"/>
+          <w:rFonts w:eastAsia="Arial" w:cs="Arial"/>
           <w:b/>
           <w:bCs/>
           <w:color w:val="0F5540"/>
@@ -10921,7 +10976,7 @@
       </w:pPr>
       <w:r>
         <w:rPr>
-          <w:rFonts w:eastAsia="Arial" w:cs="Arial" w:ascii="Arial" w:hAnsi="Arial"/>
+          <w:rFonts w:eastAsia="Arial" w:cs="Arial"/>
           <w:b/>
           <w:bCs/>
           <w:color w:val="111827"/>
@@ -11455,7 +11510,7 @@
       </w:pPr>
       <w:r>
         <w:rPr>
-          <w:rFonts w:eastAsia="Arial" w:cs="Arial" w:ascii="Arial" w:hAnsi="Arial"/>
+          <w:rFonts w:eastAsia="Arial" w:cs="Arial"/>
           <w:b/>
           <w:bCs/>
           <w:color w:val="111827"/>
@@ -11470,7 +11525,7 @@
         <w:pStyle w:val="ListParagraph"/>
         <w:numPr>
           <w:ilvl w:val="0"/>
-          <w:numId w:val="5"/>
+          <w:numId w:val="7"/>
         </w:numPr>
         <w:spacing w:before="60" w:after="60"/>
         <w:rPr/>
@@ -11490,7 +11545,7 @@
         <w:pStyle w:val="ListParagraph"/>
         <w:numPr>
           <w:ilvl w:val="0"/>
-          <w:numId w:val="2"/>
+          <w:numId w:val="4"/>
         </w:numPr>
         <w:spacing w:before="60" w:after="60"/>
         <w:rPr/>
@@ -11510,7 +11565,7 @@
         <w:pStyle w:val="ListParagraph"/>
         <w:numPr>
           <w:ilvl w:val="0"/>
-          <w:numId w:val="2"/>
+          <w:numId w:val="4"/>
         </w:numPr>
         <w:spacing w:before="60" w:after="60"/>
         <w:rPr/>
@@ -11530,7 +11585,7 @@
         <w:pStyle w:val="ListParagraph"/>
         <w:numPr>
           <w:ilvl w:val="0"/>
-          <w:numId w:val="2"/>
+          <w:numId w:val="4"/>
         </w:numPr>
         <w:spacing w:before="60" w:after="60"/>
         <w:rPr/>
@@ -11768,7 +11823,7 @@
         <w:sz w:val="18"/>
         <w:szCs w:val="18"/>
       </w:rPr>
-      <w:t xml:space="preserve">     ·     Personal Reference · 2025–2026</w:t>
+      <w:t xml:space="preserve">     ·     Personal Reference · 2026</w:t>
     </w:r>
   </w:p>
 </w:ftr>
@@ -11850,7 +11905,7 @@
         <w:sz w:val="18"/>
         <w:szCs w:val="18"/>
       </w:rPr>
-      <w:t xml:space="preserve">     ·     Personal Reference · 2025–2026</w:t>
+      <w:t xml:space="preserve">     ·     Personal Reference · 2026</w:t>
     </w:r>
   </w:p>
 </w:ftr>
@@ -11888,7 +11943,16 @@
         <w:sz w:val="18"/>
         <w:szCs w:val="18"/>
       </w:rPr>
-      <w:t>Go Learning Journey — Alan</w:t>
+      <w:t xml:space="preserve">Go Learning Journey — </w:t>
+    </w:r>
+    <w:r>
+      <w:rPr>
+        <w:rFonts w:eastAsia="Arial" w:cs="Arial"/>
+        <w:color w:val="1A7A5E"/>
+        <w:sz w:val="18"/>
+        <w:szCs w:val="18"/>
+      </w:rPr>
+      <w:t>Dev-X-Akshat</w:t>
     </w:r>
   </w:p>
 </w:hdr>
@@ -11912,7 +11976,16 @@
         <w:sz w:val="18"/>
         <w:szCs w:val="18"/>
       </w:rPr>
-      <w:t>Go Learning Journey — Alan</w:t>
+      <w:t xml:space="preserve">Go Learning Journey — </w:t>
+    </w:r>
+    <w:r>
+      <w:rPr>
+        <w:rFonts w:eastAsia="Arial" w:cs="Arial"/>
+        <w:color w:val="1A7A5E"/>
+        <w:sz w:val="18"/>
+        <w:szCs w:val="18"/>
+      </w:rPr>
+      <w:t>Dev-X-Akshat</w:t>
     </w:r>
   </w:p>
 </w:hdr>
@@ -11947,6 +12020,7 @@
         </w:tabs>
         <w:ind w:start="1080" w:hanging="360"/>
       </w:pPr>
+      <w:rPr/>
     </w:lvl>
     <w:lvl w:ilvl="2">
       <w:start w:val="1"/>
@@ -11959,6 +12033,7 @@
         </w:tabs>
         <w:ind w:start="1440" w:hanging="360"/>
       </w:pPr>
+      <w:rPr/>
     </w:lvl>
     <w:lvl w:ilvl="3">
       <w:start w:val="1"/>
@@ -11971,6 +12046,7 @@
         </w:tabs>
         <w:ind w:start="1800" w:hanging="360"/>
       </w:pPr>
+      <w:rPr/>
     </w:lvl>
     <w:lvl w:ilvl="4">
       <w:start w:val="1"/>
@@ -11983,6 +12059,7 @@
         </w:tabs>
         <w:ind w:start="2160" w:hanging="360"/>
       </w:pPr>
+      <w:rPr/>
     </w:lvl>
     <w:lvl w:ilvl="5">
       <w:start w:val="1"/>
@@ -11995,6 +12072,7 @@
         </w:tabs>
         <w:ind w:start="2520" w:hanging="360"/>
       </w:pPr>
+      <w:rPr/>
     </w:lvl>
     <w:lvl w:ilvl="6">
       <w:start w:val="1"/>
@@ -12007,6 +12085,7 @@
         </w:tabs>
         <w:ind w:start="2880" w:hanging="360"/>
       </w:pPr>
+      <w:rPr/>
     </w:lvl>
     <w:lvl w:ilvl="7">
       <w:start w:val="1"/>
@@ -12019,6 +12098,7 @@
         </w:tabs>
         <w:ind w:start="3240" w:hanging="360"/>
       </w:pPr>
+      <w:rPr/>
     </w:lvl>
     <w:lvl w:ilvl="8">
       <w:start w:val="1"/>
@@ -12031,6 +12111,7 @@
         </w:tabs>
         <w:ind w:start="3600" w:hanging="360"/>
       </w:pPr>
+      <w:rPr/>
     </w:lvl>
   </w:abstractNum>
   <w:abstractNum w:abstractNumId="2">
@@ -12058,6 +12139,7 @@
         </w:tabs>
         <w:ind w:start="1080" w:hanging="360"/>
       </w:pPr>
+      <w:rPr/>
     </w:lvl>
     <w:lvl w:ilvl="2">
       <w:start w:val="1"/>
@@ -12070,6 +12152,7 @@
         </w:tabs>
         <w:ind w:start="1440" w:hanging="360"/>
       </w:pPr>
+      <w:rPr/>
     </w:lvl>
     <w:lvl w:ilvl="3">
       <w:start w:val="1"/>
@@ -12082,6 +12165,7 @@
         </w:tabs>
         <w:ind w:start="1800" w:hanging="360"/>
       </w:pPr>
+      <w:rPr/>
     </w:lvl>
     <w:lvl w:ilvl="4">
       <w:start w:val="1"/>
@@ -12094,6 +12178,7 @@
         </w:tabs>
         <w:ind w:start="2160" w:hanging="360"/>
       </w:pPr>
+      <w:rPr/>
     </w:lvl>
     <w:lvl w:ilvl="5">
       <w:start w:val="1"/>
@@ -12106,6 +12191,7 @@
         </w:tabs>
         <w:ind w:start="2520" w:hanging="360"/>
       </w:pPr>
+      <w:rPr/>
     </w:lvl>
     <w:lvl w:ilvl="6">
       <w:start w:val="1"/>
@@ -12118,6 +12204,7 @@
         </w:tabs>
         <w:ind w:start="2880" w:hanging="360"/>
       </w:pPr>
+      <w:rPr/>
     </w:lvl>
     <w:lvl w:ilvl="7">
       <w:start w:val="1"/>
@@ -12130,6 +12217,7 @@
         </w:tabs>
         <w:ind w:start="3240" w:hanging="360"/>
       </w:pPr>
+      <w:rPr/>
     </w:lvl>
     <w:lvl w:ilvl="8">
       <w:start w:val="1"/>
@@ -12142,9 +12230,250 @@
         </w:tabs>
         <w:ind w:start="3600" w:hanging="360"/>
       </w:pPr>
+      <w:rPr/>
     </w:lvl>
   </w:abstractNum>
   <w:abstractNum w:abstractNumId="3">
+    <w:lvl w:ilvl="0">
+      <w:start w:val="1"/>
+      <w:numFmt w:val="bullet"/>
+      <w:lvlText w:val=""/>
+      <w:lvlJc w:val="start"/>
+      <w:pPr>
+        <w:tabs>
+          <w:tab w:val="num" w:pos="0"/>
+        </w:tabs>
+        <w:ind w:start="440" w:hanging="220"/>
+      </w:pPr>
+      <w:rPr>
+        <w:rFonts w:ascii="Symbol" w:hAnsi="Symbol" w:cs="Symbol" w:hint="default"/>
+      </w:rPr>
+    </w:lvl>
+    <w:lvl w:ilvl="1">
+      <w:start w:val="1"/>
+      <w:numFmt w:val="decimal"/>
+      <w:lvlText w:val="%2."/>
+      <w:lvlJc w:val="start"/>
+      <w:pPr>
+        <w:tabs>
+          <w:tab w:val="num" w:pos="1080"/>
+        </w:tabs>
+        <w:ind w:start="1080" w:hanging="360"/>
+      </w:pPr>
+      <w:rPr/>
+    </w:lvl>
+    <w:lvl w:ilvl="2">
+      <w:start w:val="1"/>
+      <w:numFmt w:val="decimal"/>
+      <w:lvlText w:val="%3."/>
+      <w:lvlJc w:val="start"/>
+      <w:pPr>
+        <w:tabs>
+          <w:tab w:val="num" w:pos="1440"/>
+        </w:tabs>
+        <w:ind w:start="1440" w:hanging="360"/>
+      </w:pPr>
+      <w:rPr/>
+    </w:lvl>
+    <w:lvl w:ilvl="3">
+      <w:start w:val="1"/>
+      <w:numFmt w:val="decimal"/>
+      <w:lvlText w:val="%4."/>
+      <w:lvlJc w:val="start"/>
+      <w:pPr>
+        <w:tabs>
+          <w:tab w:val="num" w:pos="1800"/>
+        </w:tabs>
+        <w:ind w:start="1800" w:hanging="360"/>
+      </w:pPr>
+      <w:rPr/>
+    </w:lvl>
+    <w:lvl w:ilvl="4">
+      <w:start w:val="1"/>
+      <w:numFmt w:val="decimal"/>
+      <w:lvlText w:val="%5."/>
+      <w:lvlJc w:val="start"/>
+      <w:pPr>
+        <w:tabs>
+          <w:tab w:val="num" w:pos="2160"/>
+        </w:tabs>
+        <w:ind w:start="2160" w:hanging="360"/>
+      </w:pPr>
+      <w:rPr/>
+    </w:lvl>
+    <w:lvl w:ilvl="5">
+      <w:start w:val="1"/>
+      <w:numFmt w:val="decimal"/>
+      <w:lvlText w:val="%6."/>
+      <w:lvlJc w:val="start"/>
+      <w:pPr>
+        <w:tabs>
+          <w:tab w:val="num" w:pos="2520"/>
+        </w:tabs>
+        <w:ind w:start="2520" w:hanging="360"/>
+      </w:pPr>
+      <w:rPr/>
+    </w:lvl>
+    <w:lvl w:ilvl="6">
+      <w:start w:val="1"/>
+      <w:numFmt w:val="decimal"/>
+      <w:lvlText w:val="%7."/>
+      <w:lvlJc w:val="start"/>
+      <w:pPr>
+        <w:tabs>
+          <w:tab w:val="num" w:pos="2880"/>
+        </w:tabs>
+        <w:ind w:start="2880" w:hanging="360"/>
+      </w:pPr>
+      <w:rPr/>
+    </w:lvl>
+    <w:lvl w:ilvl="7">
+      <w:start w:val="1"/>
+      <w:numFmt w:val="decimal"/>
+      <w:lvlText w:val="%8."/>
+      <w:lvlJc w:val="start"/>
+      <w:pPr>
+        <w:tabs>
+          <w:tab w:val="num" w:pos="3240"/>
+        </w:tabs>
+        <w:ind w:start="3240" w:hanging="360"/>
+      </w:pPr>
+      <w:rPr/>
+    </w:lvl>
+    <w:lvl w:ilvl="8">
+      <w:start w:val="1"/>
+      <w:numFmt w:val="decimal"/>
+      <w:lvlText w:val="%9."/>
+      <w:lvlJc w:val="start"/>
+      <w:pPr>
+        <w:tabs>
+          <w:tab w:val="num" w:pos="3600"/>
+        </w:tabs>
+        <w:ind w:start="3600" w:hanging="360"/>
+      </w:pPr>
+      <w:rPr/>
+    </w:lvl>
+  </w:abstractNum>
+  <w:abstractNum w:abstractNumId="4">
+    <w:lvl w:ilvl="0">
+      <w:start w:val="1"/>
+      <w:numFmt w:val="decimal"/>
+      <w:lvlText w:val="%1."/>
+      <w:lvlJc w:val="start"/>
+      <w:pPr>
+        <w:tabs>
+          <w:tab w:val="num" w:pos="0"/>
+        </w:tabs>
+        <w:ind w:start="440" w:hanging="220"/>
+      </w:pPr>
+      <w:rPr/>
+    </w:lvl>
+    <w:lvl w:ilvl="1">
+      <w:start w:val="1"/>
+      <w:numFmt w:val="decimal"/>
+      <w:lvlText w:val="%2."/>
+      <w:lvlJc w:val="start"/>
+      <w:pPr>
+        <w:tabs>
+          <w:tab w:val="num" w:pos="1080"/>
+        </w:tabs>
+        <w:ind w:start="1080" w:hanging="360"/>
+      </w:pPr>
+      <w:rPr/>
+    </w:lvl>
+    <w:lvl w:ilvl="2">
+      <w:start w:val="1"/>
+      <w:numFmt w:val="decimal"/>
+      <w:lvlText w:val="%3."/>
+      <w:lvlJc w:val="start"/>
+      <w:pPr>
+        <w:tabs>
+          <w:tab w:val="num" w:pos="1440"/>
+        </w:tabs>
+        <w:ind w:start="1440" w:hanging="360"/>
+      </w:pPr>
+      <w:rPr/>
+    </w:lvl>
+    <w:lvl w:ilvl="3">
+      <w:start w:val="1"/>
+      <w:numFmt w:val="decimal"/>
+      <w:lvlText w:val="%4."/>
+      <w:lvlJc w:val="start"/>
+      <w:pPr>
+        <w:tabs>
+          <w:tab w:val="num" w:pos="1800"/>
+        </w:tabs>
+        <w:ind w:start="1800" w:hanging="360"/>
+      </w:pPr>
+      <w:rPr/>
+    </w:lvl>
+    <w:lvl w:ilvl="4">
+      <w:start w:val="1"/>
+      <w:numFmt w:val="decimal"/>
+      <w:lvlText w:val="%5."/>
+      <w:lvlJc w:val="start"/>
+      <w:pPr>
+        <w:tabs>
+          <w:tab w:val="num" w:pos="2160"/>
+        </w:tabs>
+        <w:ind w:start="2160" w:hanging="360"/>
+      </w:pPr>
+      <w:rPr/>
+    </w:lvl>
+    <w:lvl w:ilvl="5">
+      <w:start w:val="1"/>
+      <w:numFmt w:val="decimal"/>
+      <w:lvlText w:val="%6."/>
+      <w:lvlJc w:val="start"/>
+      <w:pPr>
+        <w:tabs>
+          <w:tab w:val="num" w:pos="2520"/>
+        </w:tabs>
+        <w:ind w:start="2520" w:hanging="360"/>
+      </w:pPr>
+      <w:rPr/>
+    </w:lvl>
+    <w:lvl w:ilvl="6">
+      <w:start w:val="1"/>
+      <w:numFmt w:val="decimal"/>
+      <w:lvlText w:val="%7."/>
+      <w:lvlJc w:val="start"/>
+      <w:pPr>
+        <w:tabs>
+          <w:tab w:val="num" w:pos="2880"/>
+        </w:tabs>
+        <w:ind w:start="2880" w:hanging="360"/>
+      </w:pPr>
+      <w:rPr/>
+    </w:lvl>
+    <w:lvl w:ilvl="7">
+      <w:start w:val="1"/>
+      <w:numFmt w:val="decimal"/>
+      <w:lvlText w:val="%8."/>
+      <w:lvlJc w:val="start"/>
+      <w:pPr>
+        <w:tabs>
+          <w:tab w:val="num" w:pos="3240"/>
+        </w:tabs>
+        <w:ind w:start="3240" w:hanging="360"/>
+      </w:pPr>
+      <w:rPr/>
+    </w:lvl>
+    <w:lvl w:ilvl="8">
+      <w:start w:val="1"/>
+      <w:numFmt w:val="decimal"/>
+      <w:lvlText w:val="%9."/>
+      <w:lvlJc w:val="start"/>
+      <w:pPr>
+        <w:tabs>
+          <w:tab w:val="num" w:pos="3600"/>
+        </w:tabs>
+        <w:ind w:start="3600" w:hanging="360"/>
+      </w:pPr>
+      <w:rPr/>
+    </w:lvl>
+  </w:abstractNum>
+  <w:abstractNum w:abstractNumId="5">
     <w:lvl w:ilvl="0">
       <w:start w:val="1"/>
       <w:numFmt w:val="none"/>
@@ -12273,13 +12602,19 @@
     <w:abstractNumId w:val="3"/>
   </w:num>
   <w:num w:numId="4">
-    <w:abstractNumId w:val="1"/>
+    <w:abstractNumId w:val="4"/>
+  </w:num>
+  <w:num w:numId="5">
+    <w:abstractNumId w:val="5"/>
+  </w:num>
+  <w:num w:numId="6">
+    <w:abstractNumId w:val="3"/>
     <w:lvlOverride w:ilvl="0">
       <w:startOverride w:val="1"/>
     </w:lvlOverride>
   </w:num>
-  <w:num w:numId="5">
-    <w:abstractNumId w:val="2"/>
+  <w:num w:numId="7">
+    <w:abstractNumId w:val="4"/>
     <w:lvlOverride w:ilvl="0">
       <w:startOverride w:val="1"/>
     </w:lvlOverride>
@@ -12310,6 +12645,7 @@
     <w:qFormat/>
     <w:pPr>
       <w:widowControl/>
+      <w:suppressAutoHyphens w:val="true"/>
       <w:bidi w:val="0"/>
       <w:spacing w:before="0" w:after="0"/>
       <w:jc w:val="start"/>
@@ -12406,11 +12742,18 @@
       <w:u w:val="single"/>
     </w:rPr>
   </w:style>
-  <w:style w:type="character" w:styleId="FootnoteCharacters">
-    <w:name w:val="Footnote Characters"/>
+  <w:style w:type="character" w:styleId="FootnoteCharactersuser">
+    <w:name w:val="Footnote Characters (user)"/>
     <w:uiPriority w:val="99"/>
     <w:semiHidden/>
     <w:unhideWhenUsed/>
+    <w:qFormat/>
+    <w:rPr>
+      <w:vertAlign w:val="superscript"/>
+    </w:rPr>
+  </w:style>
+  <w:style w:type="character" w:styleId="FootnoteCharacters">
+    <w:name w:val="Footnote Characters"/>
     <w:qFormat/>
     <w:rPr>
       <w:vertAlign w:val="superscript"/>
@@ -12434,11 +12777,18 @@
       <w:szCs w:val="20"/>
     </w:rPr>
   </w:style>
-  <w:style w:type="character" w:styleId="EndnoteCharacters">
-    <w:name w:val="Endnote Characters"/>
+  <w:style w:type="character" w:styleId="EndnoteCharactersuser">
+    <w:name w:val="Endnote Characters (user)"/>
     <w:uiPriority w:val="99"/>
     <w:semiHidden/>
     <w:unhideWhenUsed/>
+    <w:qFormat/>
+    <w:rPr>
+      <w:vertAlign w:val="superscript"/>
+    </w:rPr>
+  </w:style>
+  <w:style w:type="character" w:styleId="EndnoteCharacters">
+    <w:name w:val="Endnote Characters"/>
     <w:qFormat/>
     <w:rPr>
       <w:vertAlign w:val="superscript"/>
@@ -12535,6 +12885,7 @@
     <w:qFormat/>
     <w:pPr>
       <w:widowControl/>
+      <w:suppressAutoHyphens w:val="true"/>
       <w:bidi w:val="0"/>
       <w:spacing w:before="0" w:after="0"/>
       <w:jc w:val="start"/>
@@ -12555,6 +12906,7 @@
     <w:qFormat/>
     <w:pPr>
       <w:widowControl/>
+      <w:suppressAutoHyphens w:val="true"/>
       <w:bidi w:val="0"/>
       <w:spacing w:before="0" w:after="0"/>
       <w:jc w:val="start"/>
@@ -12628,37 +12980,37 @@
         <a:srgbClr val="000000"/>
       </a:dk1>
       <a:lt1>
-        <a:srgbClr val="ffffff"/>
+        <a:srgbClr val="FFFFFF"/>
       </a:lt1>
       <a:dk2>
         <a:srgbClr val="000000"/>
       </a:dk2>
       <a:lt2>
-        <a:srgbClr val="ffffff"/>
+        <a:srgbClr val="FFFFFF"/>
       </a:lt2>
       <a:accent1>
-        <a:srgbClr val="18a303"/>
+        <a:srgbClr val="18A303"/>
       </a:accent1>
       <a:accent2>
-        <a:srgbClr val="0369a3"/>
+        <a:srgbClr val="0369A3"/>
       </a:accent2>
       <a:accent3>
-        <a:srgbClr val="a33e03"/>
+        <a:srgbClr val="A33E03"/>
       </a:accent3>
       <a:accent4>
-        <a:srgbClr val="8e03a3"/>
+        <a:srgbClr val="8E03A3"/>
       </a:accent4>
       <a:accent5>
-        <a:srgbClr val="c99c00"/>
+        <a:srgbClr val="C99C00"/>
       </a:accent5>
       <a:accent6>
-        <a:srgbClr val="c9211e"/>
+        <a:srgbClr val="C9211E"/>
       </a:accent6>
       <a:hlink>
-        <a:srgbClr val="0000ee"/>
+        <a:srgbClr val="0000EE"/>
       </a:hlink>
       <a:folHlink>
-        <a:srgbClr val="551a8b"/>
+        <a:srgbClr val="551A8B"/>
       </a:folHlink>
     </a:clrScheme>
     <a:fontScheme name="Office">

</xml_diff>